<commit_message>
Update PartyPulse Fejlesztői Dokumentáció.docx
</commit_message>
<xml_diff>
--- a/PartyPulse Fejlesztői Dokumentáció.docx
+++ b/PartyPulse Fejlesztői Dokumentáció.docx
@@ -1612,12 +1612,10 @@
         <w:t xml:space="preserve">Husky </w:t>
       </w:r>
       <w:proofErr w:type="spellStart"/>
-      <w:proofErr w:type="gramStart"/>
       <w:r>
         <w:t>pre-commit</w:t>
       </w:r>
       <w:proofErr w:type="spellEnd"/>
-      <w:proofErr w:type="gramEnd"/>
       <w:r>
         <w:t xml:space="preserve"> </w:t>
       </w:r>
@@ -2472,7 +2470,13 @@
       </w:pPr>
       <w:proofErr w:type="spellStart"/>
       <w:r>
-        <w:t>Partiionálás</w:t>
+        <w:t>Parti</w:t>
+      </w:r>
+      <w:r>
+        <w:t>c</w:t>
+      </w:r>
+      <w:r>
+        <w:t>ionálás</w:t>
       </w:r>
       <w:proofErr w:type="spellEnd"/>
       <w:r>
@@ -3162,17 +3166,12 @@
         <w:t xml:space="preserve">Mivel a fejlesztés </w:t>
       </w:r>
       <w:proofErr w:type="spellStart"/>
-      <w:proofErr w:type="gramStart"/>
       <w:r>
         <w:t>pre</w:t>
       </w:r>
       <w:proofErr w:type="spellEnd"/>
       <w:r>
-        <w:t>-implementációs</w:t>
-      </w:r>
-      <w:proofErr w:type="gramEnd"/>
-      <w:r>
-        <w:t xml:space="preserve">, az algoritmusok hipotetikusak, de a </w:t>
+        <w:t xml:space="preserve">-implementációs, az algoritmusok hipotetikusak, de a </w:t>
       </w:r>
       <w:proofErr w:type="spellStart"/>
       <w:r>
@@ -3606,15 +3605,7 @@
       </w:r>
       <w:proofErr w:type="spellEnd"/>
       <w:r>
-        <w:t xml:space="preserve">-ben: </w:t>
-      </w:r>
-      <w:proofErr w:type="gramStart"/>
-      <w:r>
-        <w:t>RANK(</w:t>
-      </w:r>
-      <w:proofErr w:type="gramEnd"/>
-      <w:r>
-        <w:t xml:space="preserve">) OVER (ORDER BY </w:t>
+        <w:t xml:space="preserve">-ben: RANK() OVER (ORDER BY </w:t>
       </w:r>
       <w:proofErr w:type="spellStart"/>
       <w:r>
@@ -3794,12 +3785,10 @@
         <w:t xml:space="preserve">Felhasználó pozíció: </w:t>
       </w:r>
       <w:proofErr w:type="spellStart"/>
-      <w:proofErr w:type="gramStart"/>
       <w:r>
         <w:t>Navigator.geolocation.getCurrentPosition</w:t>
       </w:r>
       <w:proofErr w:type="spellEnd"/>
-      <w:proofErr w:type="gramEnd"/>
       <w:r>
         <w:t>.</w:t>
       </w:r>
@@ -3829,32 +3818,19 @@
       </w:r>
       <w:proofErr w:type="spellStart"/>
       <w:r>
-        <w:t>ST_Distance_</w:t>
-      </w:r>
-      <w:proofErr w:type="gramStart"/>
-      <w:r>
-        <w:t>Sphere</w:t>
+        <w:t>ST_Distance_Sphere</w:t>
       </w:r>
       <w:proofErr w:type="spellEnd"/>
       <w:r>
         <w:t>(</w:t>
       </w:r>
       <w:proofErr w:type="spellStart"/>
-      <w:proofErr w:type="gramEnd"/>
       <w:r>
         <w:t>Location</w:t>
       </w:r>
       <w:proofErr w:type="spellEnd"/>
       <w:r>
-        <w:t xml:space="preserve">, </w:t>
-      </w:r>
-      <w:proofErr w:type="gramStart"/>
-      <w:r>
-        <w:t>POINT(</w:t>
-      </w:r>
-      <w:proofErr w:type="gramEnd"/>
-      <w:r>
-        <w:t xml:space="preserve">lat, </w:t>
+        <w:t xml:space="preserve">, POINT(lat, </w:t>
       </w:r>
       <w:proofErr w:type="spellStart"/>
       <w:r>
@@ -3862,18 +3838,13 @@
       </w:r>
       <w:proofErr w:type="spellEnd"/>
       <w:r>
-        <w:t xml:space="preserve">)) </w:t>
-      </w:r>
-      <w:proofErr w:type="gramStart"/>
-      <w:r>
-        <w:t xml:space="preserve">&lt; </w:t>
+        <w:t xml:space="preserve">)) &lt; </w:t>
       </w:r>
       <w:proofErr w:type="spellStart"/>
       <w:r>
         <w:t>radius</w:t>
       </w:r>
       <w:proofErr w:type="spellEnd"/>
-      <w:proofErr w:type="gramEnd"/>
       <w:r>
         <w:t>.</w:t>
       </w:r>
@@ -3920,15 +3891,7 @@
     </w:p>
     <w:p>
       <w:r>
-        <w:t xml:space="preserve">Ezek az algoritmusok optimalizáltak teljesítményre, pl. </w:t>
-      </w:r>
-      <w:proofErr w:type="gramStart"/>
-      <w:r>
-        <w:t>O(</w:t>
-      </w:r>
-      <w:proofErr w:type="gramEnd"/>
-      <w:r>
-        <w:t>n log n) ranglistákra indexekkel.</w:t>
+        <w:t>Ezek az algoritmusok optimalizáltak teljesítményre, pl. O(n log n) ranglistákra indexekkel.</w:t>
       </w:r>
     </w:p>
     <w:p>
@@ -4055,15 +4018,7 @@
       </w:r>
       <w:proofErr w:type="spellEnd"/>
       <w:r>
-        <w:t xml:space="preserve">: </w:t>
-      </w:r>
-      <w:proofErr w:type="gramStart"/>
-      <w:r>
-        <w:t>test(</w:t>
-      </w:r>
-      <w:proofErr w:type="gramEnd"/>
-      <w:r>
-        <w:t>'</w:t>
+        <w:t>: test('</w:t>
       </w:r>
       <w:proofErr w:type="spellStart"/>
       <w:r>
@@ -4087,18 +4042,13 @@
       </w:r>
       <w:proofErr w:type="spellEnd"/>
       <w:r>
-        <w:t xml:space="preserve">', () =&gt; </w:t>
-      </w:r>
-      <w:proofErr w:type="gramStart"/>
-      <w:r>
-        <w:t xml:space="preserve">{ </w:t>
+        <w:t xml:space="preserve">', () =&gt; { </w:t>
       </w:r>
       <w:proofErr w:type="spellStart"/>
       <w:r>
         <w:t>render</w:t>
       </w:r>
       <w:proofErr w:type="spellEnd"/>
-      <w:proofErr w:type="gramEnd"/>
       <w:r>
         <w:t>(&lt;</w:t>
       </w:r>
@@ -4119,12 +4069,10 @@
         <w:t>(</w:t>
       </w:r>
       <w:proofErr w:type="spellStart"/>
-      <w:proofErr w:type="gramStart"/>
       <w:r>
         <w:t>screen.getByText</w:t>
       </w:r>
       <w:proofErr w:type="spellEnd"/>
-      <w:proofErr w:type="gramEnd"/>
       <w:r>
         <w:t>(/</w:t>
       </w:r>
@@ -4134,28 +4082,15 @@
       </w:r>
       <w:proofErr w:type="spellEnd"/>
       <w:r>
-        <w:t>/)</w:t>
-      </w:r>
-      <w:proofErr w:type="gramStart"/>
-      <w:r>
-        <w:t>).</w:t>
+        <w:t>/)).</w:t>
       </w:r>
       <w:proofErr w:type="spellStart"/>
       <w:r>
         <w:t>toBeInTheDocument</w:t>
       </w:r>
       <w:proofErr w:type="spellEnd"/>
-      <w:proofErr w:type="gramEnd"/>
-      <w:r>
-        <w:t>()</w:t>
-      </w:r>
-      <w:proofErr w:type="gramStart"/>
-      <w:r>
-        <w:t>; }</w:t>
-      </w:r>
-      <w:proofErr w:type="gramEnd"/>
-      <w:r>
-        <w:t>);</w:t>
+      <w:r>
+        <w:t>(); });</w:t>
       </w:r>
     </w:p>
     <w:p>
@@ -4210,27 +4145,11 @@
       </w:r>
       <w:proofErr w:type="spellStart"/>
       <w:r>
-        <w:t>CalculatePoints_</w:t>
-      </w:r>
-      <w:proofErr w:type="gramStart"/>
-      <w:r>
-        <w:t>AddsCorrectly</w:t>
-      </w:r>
-      <w:proofErr w:type="spellEnd"/>
-      <w:r>
-        <w:t>(</w:t>
-      </w:r>
-      <w:proofErr w:type="gramEnd"/>
-      <w:r>
-        <w:t xml:space="preserve">) </w:t>
-      </w:r>
-      <w:proofErr w:type="gramStart"/>
-      <w:r>
-        <w:t>{ var</w:t>
-      </w:r>
-      <w:proofErr w:type="gramEnd"/>
-      <w:r>
-        <w:t xml:space="preserve"> service = </w:t>
+        <w:t>CalculatePoints_AddsCorrectly</w:t>
+      </w:r>
+      <w:proofErr w:type="spellEnd"/>
+      <w:r>
+        <w:t xml:space="preserve">() { var service = </w:t>
       </w:r>
       <w:proofErr w:type="spellStart"/>
       <w:r>
@@ -4241,17 +4160,12 @@
         <w:t xml:space="preserve"> </w:t>
       </w:r>
       <w:proofErr w:type="spellStart"/>
-      <w:proofErr w:type="gramStart"/>
       <w:r>
         <w:t>PointService</w:t>
       </w:r>
       <w:proofErr w:type="spellEnd"/>
       <w:r>
-        <w:t>(</w:t>
-      </w:r>
-      <w:proofErr w:type="gramEnd"/>
-      <w:r>
-        <w:t xml:space="preserve">); </w:t>
+        <w:t xml:space="preserve">(); </w:t>
       </w:r>
       <w:proofErr w:type="spellStart"/>
       <w:r>
@@ -4262,20 +4176,13 @@
         <w:t xml:space="preserve">(10, </w:t>
       </w:r>
       <w:proofErr w:type="spellStart"/>
-      <w:proofErr w:type="gramStart"/>
       <w:r>
         <w:t>service.AddPoints</w:t>
       </w:r>
       <w:proofErr w:type="spellEnd"/>
-      <w:proofErr w:type="gramEnd"/>
-      <w:r>
-        <w:t>(5, 5))</w:t>
-      </w:r>
-      <w:proofErr w:type="gramStart"/>
-      <w:r>
-        <w:t>; }</w:t>
-      </w:r>
-      <w:proofErr w:type="gramEnd"/>
+      <w:r>
+        <w:t>(5, 5)); }</w:t>
+      </w:r>
     </w:p>
     <w:p>
       <w:pPr>
@@ -4412,12 +4319,10 @@
         <w:t xml:space="preserve">: </w:t>
       </w:r>
       <w:proofErr w:type="spellStart"/>
-      <w:proofErr w:type="gramStart"/>
       <w:r>
         <w:t>cy.visit</w:t>
       </w:r>
       <w:proofErr w:type="spellEnd"/>
-      <w:proofErr w:type="gramEnd"/>
       <w:r>
         <w:t>('/</w:t>
       </w:r>
@@ -4435,44 +4340,29 @@
       </w:r>
       <w:proofErr w:type="spellEnd"/>
       <w:r>
-        <w:t>(</w:t>
-      </w:r>
-      <w:proofErr w:type="gramStart"/>
-      <w:r>
-        <w:t>'.</w:t>
-      </w:r>
-      <w:proofErr w:type="spellStart"/>
-      <w:r>
-        <w:t>event</w:t>
-      </w:r>
-      <w:proofErr w:type="gramEnd"/>
-      <w:r>
-        <w:t>-card</w:t>
-      </w:r>
-      <w:proofErr w:type="spellEnd"/>
-      <w:r>
-        <w:t>'</w:t>
-      </w:r>
-      <w:proofErr w:type="gramStart"/>
-      <w:r>
-        <w:t>).</w:t>
+        <w:t>('.</w:t>
+      </w:r>
+      <w:proofErr w:type="spellStart"/>
+      <w:r>
+        <w:t>event-card</w:t>
+      </w:r>
+      <w:proofErr w:type="spellEnd"/>
+      <w:r>
+        <w:t>').</w:t>
       </w:r>
       <w:proofErr w:type="spellStart"/>
       <w:r>
         <w:t>click</w:t>
       </w:r>
       <w:proofErr w:type="spellEnd"/>
-      <w:proofErr w:type="gramEnd"/>
       <w:r>
         <w:t xml:space="preserve">(); </w:t>
       </w:r>
       <w:proofErr w:type="spellStart"/>
-      <w:proofErr w:type="gramStart"/>
       <w:r>
         <w:t>cy.contains</w:t>
       </w:r>
       <w:proofErr w:type="spellEnd"/>
-      <w:proofErr w:type="gramEnd"/>
       <w:r>
         <w:t>('</w:t>
       </w:r>
@@ -7401,6 +7291,7 @@
   <w:style w:type="character" w:default="1" w:styleId="Bekezdsalapbettpusa">
     <w:name w:val="Default Paragraph Font"/>
     <w:uiPriority w:val="1"/>
+    <w:semiHidden/>
     <w:unhideWhenUsed/>
   </w:style>
   <w:style w:type="table" w:default="1" w:styleId="Normltblzat">

</xml_diff>